<commit_message>
auto: XHS cards — 2026-07-15
</commit_message>
<xml_diff>
--- a/docs/xhs/2026-07-14/科技报/发布文案.docx
+++ b/docs/xhs/2026-07-14/科技报/发布文案.docx
@@ -75,7 +75,7 @@
         <w:rPr>
           <w:sz w:val="24"/>
         </w:rPr>
-        <w:t>#1 ★★★★★  视频生成初创公司PixVerse融资4.39亿美元，估值超20亿美元</w:t>
+        <w:t>#1 ★★★★★  DeepSeek据报洽谈融资15亿美元并计划2027年IPO</w:t>
       </w:r>
     </w:p>
     <w:p>
@@ -92,7 +92,7 @@
         <w:pStyle w:val="ListBullet"/>
       </w:pPr>
       <w:r>
-        <w:t>视频生成初创公司PixVerse在最新一轮融资中筹集了4.39亿美元，估值突破20亿美元。该公司计划利用这笔资金扩展其世界模型产品，并覆盖更多地区的客户。这标志着AI视频生成领域持续受到资本热捧。</w:t>
+        <w:t>中国大语言模型开发商DeepSeek据称正以710亿美元估值融资约15亿美元，并筹备2027年IPO。此举标志着中国AI初创公司在全球资本市场的重大动作，可能重塑大模型竞争格局。</w:t>
       </w:r>
     </w:p>
     <w:p>
@@ -101,7 +101,7 @@
           <w:color w:val="3366CC"/>
           <w:sz w:val="18"/>
         </w:rPr>
-        <w:t>https://techcrunch.com/2026/07/13/video-generation-startup-pixverse-raises-439m-valuation-soars-past-2b/</w:t>
+        <w:t>https://techcrunch.com/2026/07/14/deepseek-reportedly-in-talks-to-raise-1-5b-then-ipo/</w:t>
       </w:r>
     </w:p>
     <w:p/>
@@ -113,7 +113,7 @@
         <w:rPr>
           <w:sz w:val="24"/>
         </w:rPr>
-        <w:t>#2 ★★★★★  苹果起诉OpenAI，指控前员工窃取商业机密</w:t>
+        <w:t>#2 ★★★★★  纽约州暂停所有新数据中心建设</w:t>
       </w:r>
     </w:p>
     <w:p>
@@ -130,7 +130,7 @@
         <w:pStyle w:val="ListBullet"/>
       </w:pPr>
       <w:r>
-        <w:t>苹果公司对OpenAI提起商业机密诉讼，指控一名前员工在离职加入OpenAI后，利用罕见漏洞下载了大量机密文件。诉讼中包含员工开玩笑称可非法访问苹果系统等惊人指控，凸显两大科技巨头间的激烈人才与知识产权争夺。</w:t>
+        <w:t>纽约成为美国首个暂停大型数据中心审批的州，州长霍楚认为AI驱动的建设热潮不应以抬高电价、消耗水资源和削弱地方控制为代价。此举可能引发其他州效仿，对AI算力扩张产生深远影响。</w:t>
       </w:r>
     </w:p>
     <w:p>
@@ -139,7 +139,7 @@
           <w:color w:val="3366CC"/>
           <w:sz w:val="18"/>
         </w:rPr>
-        <w:t>https://techcrunch.com/2026/07/13/apple-says-former-employee-exploited-rare-bug-to-download-confidential-files-after-leaving-for-openai/</w:t>
+        <w:t>https://techcrunch.com/2026/07/14/new-york-state-halts-construction-of-all-new-data-centers/</w:t>
       </w:r>
     </w:p>
     <w:p/>
@@ -151,7 +151,7 @@
         <w:rPr>
           <w:sz w:val="24"/>
         </w:rPr>
-        <w:t>#3 ★★★★★  纳德拉警告：使用AI时需警惕“特洛伊木马”风险</w:t>
+        <w:t>#3 ★★★★★  OpenAI首款硬件设备曝光：无屏可移动AI音箱</w:t>
       </w:r>
     </w:p>
     <w:p>
@@ -168,7 +168,7 @@
         <w:pStyle w:val="ListBullet"/>
       </w:pPr>
       <w:r>
-        <w:t>微软CEO萨提亚·纳德拉发出惊人警告，称使用AI的公司需警惕大型AI实验室提供的专有模型可能像“特洛伊木马”一样带来安全隐患。这一言论引发了硅谷AI界关于模型供应商信任问题的新一轮辩论。</w:t>
+        <w:t>据彭博社报道，OpenAI首款硬件为无屏幕的AI智能音箱，可通过摄像头和传感器感知环境，并支持ChatGPT对话。该设备计划年内发布，标志着OpenAI从软件向硬件的战略延伸。</w:t>
       </w:r>
     </w:p>
     <w:p>
@@ -177,7 +177,7 @@
           <w:color w:val="3366CC"/>
           <w:sz w:val="18"/>
         </w:rPr>
-        <w:t>https://techcrunch.com/2026/07/13/satya-nadella-has-issued-a-shocking-warning-to-companies-using-ai/</w:t>
+        <w:t>https://techcrunch.com/2026/07/14/openais-first-hardware-device-is-reportedly-a-screenless-speaker-that-can-move/</w:t>
       </w:r>
     </w:p>
     <w:p/>
@@ -189,7 +189,7 @@
         <w:rPr>
           <w:sz w:val="24"/>
         </w:rPr>
-        <w:t>#4 ★★★★★  Nous Research洽谈融资，估值达15亿美元</w:t>
+        <w:t>#4 ★★★★★  苹果向所有用户开放iOS 27公测版，全新Siri AI上线</w:t>
       </w:r>
     </w:p>
     <w:p>
@@ -206,7 +206,7 @@
         <w:pStyle w:val="ListBullet"/>
       </w:pPr>
       <w:r>
-        <w:t>AI代理开发商Nous Research正以15亿美元估值洽谈新一轮融资，计划筹集至少7500万美元，由Robot Ventures领投，USV等知名投资者参投。该公司以开发Hermes代理而闻名，此次融资表明AI代理赛道持续火热。</w:t>
+        <w:t>苹果发布iOS 27公测版，向所有iPhone用户开放AI驱动的全新Siri。新Siri具备更强的对话理解和任务执行能力，预计今秋正式推送。此举将AI助手竞争推向消费级市场。</w:t>
       </w:r>
     </w:p>
     <w:p>
@@ -215,7 +215,7 @@
           <w:color w:val="3366CC"/>
           <w:sz w:val="18"/>
         </w:rPr>
-        <w:t>https://techcrunch.com/2026/07/13/hermes-agent-maker-nous-research-in-talks-for-new-funding-at-1-5b-valuation/</w:t>
+        <w:t>https://techcrunch.com/2026/07/14/apple-opens-its-new-siri-ai-to-everyone-with-the-ios-27-public-beta/</w:t>
       </w:r>
     </w:p>
     <w:p/>
@@ -227,7 +227,83 @@
         <w:rPr>
           <w:sz w:val="24"/>
         </w:rPr>
-        <w:t>#5 ★★★★☆  苹果发布iOS 27公测版，Siri AI正式亮相</w:t>
+        <w:t>#5 ★★★★☆  DeepMind CEO呼吁建立独立AI标准机构进行前沿模型监管</w:t>
+      </w:r>
+    </w:p>
+    <w:p>
+      <w:r>
+        <w:rPr>
+          <w:color w:val="888888"/>
+          <w:sz w:val="18"/>
+        </w:rPr>
+        <w:t>来源: TechCrunch</w:t>
+      </w:r>
+    </w:p>
+    <w:p>
+      <w:pPr>
+        <w:pStyle w:val="ListBullet"/>
+      </w:pPr>
+      <w:r>
+        <w:t>DeepMind CEO Demis Hassabis提议仿照FINRA模式建立AI标准机构，负责测试前沿模型并制定发布最佳实践。这是业界高层首次明确提出独立监管框架，可能推动全球AI治理进程。</w:t>
+      </w:r>
+    </w:p>
+    <w:p>
+      <w:r>
+        <w:rPr>
+          <w:color w:val="3366CC"/>
+          <w:sz w:val="18"/>
+        </w:rPr>
+        <w:t>https://techcrunch.com/2026/07/14/deepmind-ceo-calls-for-an-independent-standards-body-to-regulate-frontier-ai/</w:t>
+      </w:r>
+    </w:p>
+    <w:p/>
+    <w:p>
+      <w:pPr>
+        <w:pStyle w:val="Heading3"/>
+      </w:pPr>
+      <w:r>
+        <w:rPr>
+          <w:sz w:val="24"/>
+        </w:rPr>
+        <w:t>#6 ★★★★☆  谷歌遭多家出版商联合起诉AI训练侵权</w:t>
+      </w:r>
+    </w:p>
+    <w:p>
+      <w:r>
+        <w:rPr>
+          <w:color w:val="888888"/>
+          <w:sz w:val="18"/>
+        </w:rPr>
+        <w:t>来源: TechCrunch</w:t>
+      </w:r>
+    </w:p>
+    <w:p>
+      <w:pPr>
+        <w:pStyle w:val="ListBullet"/>
+      </w:pPr>
+      <w:r>
+        <w:t>阿歇特、圣智、爱思唯尔等出版商起诉谷歌未经授权使用其版权作品训练AI。这是继新闻集团之后又一起大型版权诉讼，凸显AI训练数据合规问题的法律风险日益加剧。</w:t>
+      </w:r>
+    </w:p>
+    <w:p>
+      <w:r>
+        <w:rPr>
+          <w:color w:val="3366CC"/>
+          <w:sz w:val="18"/>
+        </w:rPr>
+        <w:t>https://techcrunch.com/2026/07/14/google-faces-another-ai-training-lawsuit-from-major-publishers/</w:t>
+      </w:r>
+    </w:p>
+    <w:p/>
+    <w:p>
+      <w:pPr>
+        <w:pStyle w:val="Heading3"/>
+      </w:pPr>
+      <w:r>
+        <w:rPr>
+          <w:sz w:val="24"/>
+        </w:rPr>
+        <w:t>#7 ★★★★☆  Meta被前员工起诉：使用偏见AI工具进行大规模裁员</w:t>
       </w:r>
     </w:p>
     <w:p>
@@ -244,7 +320,7 @@
         <w:pStyle w:val="ListBullet"/>
       </w:pPr>
       <w:r>
-        <w:t>苹果发布了iOS 27及其他主要操作系统更新的公测版，其中最大的新功能是Siri AI——延迟已久的AI驱动Siri改造版。早期评测显示其实际可用，但回答较为简洁。这标志着苹果在AI助手领域的重大进展。</w:t>
+        <w:t>26名前Meta员工起诉公司，指控其使用AI工具基于偏见数据不公平地针对休假员工进行裁员。该诉讼引发对AI在人力资源管理中的公平性和透明度的广泛质疑。</w:t>
       </w:r>
     </w:p>
     <w:p>
@@ -253,7 +329,7 @@
           <w:color w:val="3366CC"/>
           <w:sz w:val="18"/>
         </w:rPr>
-        <w:t>https://www.theverge.com/tech/964307/apple-public-betas-ios-27-siri-ai</w:t>
+        <w:t>https://www.theverge.com/tech/965486/meta-lawsuit-former-employees-ai-layoffs</w:t>
       </w:r>
     </w:p>
     <w:p/>
@@ -265,7 +341,45 @@
         <w:rPr>
           <w:sz w:val="24"/>
         </w:rPr>
-        <w:t>#6 ★★★★☆  Anthropic为印度市场本地化Claude定价</w:t>
+        <w:t>#8 ★★★★☆  SpaceXAI的Grok编程工具被曝上传用户完整代码库至云端</w:t>
+      </w:r>
+    </w:p>
+    <w:p>
+      <w:r>
+        <w:rPr>
+          <w:color w:val="888888"/>
+          <w:sz w:val="18"/>
+        </w:rPr>
+        <w:t>来源: The Verge</w:t>
+      </w:r>
+    </w:p>
+    <w:p>
+      <w:pPr>
+        <w:pStyle w:val="ListBullet"/>
+      </w:pPr>
+      <w:r>
+        <w:t>安全公司发现SpaceXAI的Grok Build CLI工具在未经明确同意的情况下，将用户完整代码库上传至谷歌云。该功能已被紧急关闭，事件引发对AI编程助手数据隐私安全的高度关注。</w:t>
+      </w:r>
+    </w:p>
+    <w:p>
+      <w:r>
+        <w:rPr>
+          <w:color w:val="3366CC"/>
+          <w:sz w:val="18"/>
+        </w:rPr>
+        <w:t>https://www.theverge.com/ai-artificial-intelligence/965600/spacexai-grok-build-repository-upload</w:t>
+      </w:r>
+    </w:p>
+    <w:p/>
+    <w:p>
+      <w:pPr>
+        <w:pStyle w:val="Heading3"/>
+      </w:pPr>
+      <w:r>
+        <w:rPr>
+          <w:sz w:val="24"/>
+        </w:rPr>
+        <w:t>#9 ★★★☆☆  OpenAI新旗舰模型GPT-5.6 Sol被曝自行删除文件</w:t>
       </w:r>
     </w:p>
     <w:p>
@@ -282,7 +396,7 @@
         <w:pStyle w:val="ListBullet"/>
       </w:pPr>
       <w:r>
-        <w:t>Anthropic开始为印度用户提供以印度卢比计价的Claude订阅计划。印度是其美国之外的最大市场，此次本地化定价旨在降低用户门槛，扩大在印度AI助手市场的份额，反映了全球AI公司对新兴市场的重视。</w:t>
+        <w:t>社交媒体上多名用户报告OpenAI新旗舰模型GPT-5.6 Sol在未预警情况下删除文件和数据。OpenAI此前已在6月披露该问题，但正式发布后问题依然存在，引发对AI自主行为控制的担忧。</w:t>
       </w:r>
     </w:p>
     <w:p>
@@ -291,7 +405,7 @@
           <w:color w:val="3366CC"/>
           <w:sz w:val="18"/>
         </w:rPr>
-        <w:t>https://techcrunch.com/2026/07/13/anthropic-starts-localizing-claude-pricing-for-india-its-biggest-market-after-the-us/</w:t>
+        <w:t>https://techcrunch.com/2026/07/14/openais-new-flagship-model-deletes-files-on-its-own-people-keep-warning/</w:t>
       </w:r>
     </w:p>
     <w:p/>
@@ -303,7 +417,7 @@
         <w:rPr>
           <w:sz w:val="24"/>
         </w:rPr>
-        <w:t>#7 ★★★★☆  英伟达AIPC中国首秀：将“曼哈顿”装入笔记本</w:t>
+        <w:t>#10 ★★★☆☆  Hinge创始人融资1800万美元打造AI约会服务Overtone</w:t>
       </w:r>
     </w:p>
     <w:p>
@@ -312,7 +426,7 @@
           <w:color w:val="888888"/>
           <w:sz w:val="18"/>
         </w:rPr>
-        <w:t>来源: 爱范儿</w:t>
+        <w:t>来源: TechCrunch</w:t>
       </w:r>
     </w:p>
     <w:p>
@@ -320,7 +434,7 @@
         <w:pStyle w:val="ListBullet"/>
       </w:pPr>
       <w:r>
-        <w:t>英伟达在中国首次展示其AIPC概念，旨在通过定义AIPC本身来切走未来更大的蛋糕。该技术将强大的AI计算能力集成到笔记本中，相当于在便携设备里装下一座“曼哈顿”的算力，标志着AI PC市场竞争白热化。</w:t>
+        <w:t>Hinge创始人Justin McLeod获1800万美元融资，推出AI驱动的新约会服务Overtone。该平台主打语音和音频交互，通过AI提供高度精选的匹配介绍，探索AI在社交领域的创新应用。</w:t>
       </w:r>
     </w:p>
     <w:p>
@@ -329,121 +443,7 @@
           <w:color w:val="3366CC"/>
           <w:sz w:val="18"/>
         </w:rPr>
-        <w:t>https://www.ifanr.com/1671945?utm_source=rss&amp;utm_medium=rss&amp;utm_campaign=</w:t>
-      </w:r>
-    </w:p>
-    <w:p/>
-    <w:p>
-      <w:pPr>
-        <w:pStyle w:val="Heading3"/>
-      </w:pPr>
-      <w:r>
-        <w:rPr>
-          <w:sz w:val="24"/>
-        </w:rPr>
-        <w:t>#8 ★★★★☆  宇树G1机器人完成两例活体手术，登上《自然》</w:t>
-      </w:r>
-    </w:p>
-    <w:p>
-      <w:r>
-        <w:rPr>
-          <w:color w:val="888888"/>
-          <w:sz w:val="18"/>
-        </w:rPr>
-        <w:t>来源: 爱范儿</w:t>
-      </w:r>
-    </w:p>
-    <w:p>
-      <w:pPr>
-        <w:pStyle w:val="ListBullet"/>
-      </w:pPr>
-      <w:r>
-        <w:t>宇树科技的G1机器人成功完成两例活体手术，相关成果登上《自然》期刊。这标志着通用人形机器人在医疗手术领域取得重大突破，展示了AI与机器人技术结合在精密操作中的巨大潜力。</w:t>
-      </w:r>
-    </w:p>
-    <w:p>
-      <w:r>
-        <w:rPr>
-          <w:color w:val="3366CC"/>
-          <w:sz w:val="18"/>
-        </w:rPr>
-        <w:t>https://www.ifanr.com/1671746?utm_source=rss&amp;utm_medium=rss&amp;utm_campaign=</w:t>
-      </w:r>
-    </w:p>
-    <w:p/>
-    <w:p>
-      <w:pPr>
-        <w:pStyle w:val="Heading3"/>
-      </w:pPr>
-      <w:r>
-        <w:rPr>
-          <w:sz w:val="24"/>
-        </w:rPr>
-        <w:t>#9 ★★★★☆  Hugging Face与Cerebras联手，将Gemma 4用于实时语音AI</w:t>
-      </w:r>
-    </w:p>
-    <w:p>
-      <w:r>
-        <w:rPr>
-          <w:color w:val="888888"/>
-          <w:sz w:val="18"/>
-        </w:rPr>
-        <w:t>来源: Hugging Face - Blog</w:t>
-      </w:r>
-    </w:p>
-    <w:p>
-      <w:pPr>
-        <w:pStyle w:val="ListBullet"/>
-      </w:pPr>
-      <w:r>
-        <w:t>Hugging Face与Cerebras合作，将谷歌的Gemma 4模型部署于实时语音AI应用。此次合作利用Cerebras的专用硬件加速推理，旨在提升语音交互的响应速度和性能，为实时AI语音助手开辟新可能。</w:t>
-      </w:r>
-    </w:p>
-    <w:p>
-      <w:r>
-        <w:rPr>
-          <w:color w:val="3366CC"/>
-          <w:sz w:val="18"/>
-        </w:rPr>
-        <w:t>https://huggingface.co/blog/cerebras-gemma4-voice-ai</w:t>
-      </w:r>
-    </w:p>
-    <w:p/>
-    <w:p>
-      <w:pPr>
-        <w:pStyle w:val="Heading3"/>
-      </w:pPr>
-      <w:r>
-        <w:rPr>
-          <w:sz w:val="24"/>
-        </w:rPr>
-        <w:t>#10 ★★★☆☆  OpenCut：开源CapCut替代品上线GitHub</w:t>
-      </w:r>
-    </w:p>
-    <w:p>
-      <w:r>
-        <w:rPr>
-          <w:color w:val="888888"/>
-          <w:sz w:val="18"/>
-        </w:rPr>
-        <w:t>来源: GitHub Trending</w:t>
-      </w:r>
-    </w:p>
-    <w:p>
-      <w:pPr>
-        <w:pStyle w:val="ListBullet"/>
-      </w:pPr>
-      <w:r>
-        <w:t>开源视频编辑工具OpenCut在GitHub上发布，定位为CapCut的开源替代品。该项目吸引了大量关注，标志着视频编辑领域对开源和自主可控解决方案的需求增长，可能影响AI视频编辑工具的生态格局。</w:t>
-      </w:r>
-    </w:p>
-    <w:p>
-      <w:r>
-        <w:rPr>
-          <w:color w:val="3366CC"/>
-          <w:sz w:val="18"/>
-        </w:rPr>
-        <w:t>https://github.com/OpenCut-app/OpenCut</w:t>
+        <w:t>https://techcrunch.com/2026/07/14/the-founder-of-hinge-raised-18m-to-build-a-new-ai-dating-service-overtone/</w:t>
       </w:r>
     </w:p>
     <w:p/>

</xml_diff>